<commit_message>
Fill in Step 2a/Step 4 fund pairs and objective calculations
Portfolio fund pairs (student-selected):
- Portfolio 1: Health Care (40%) / Information Technology (60%)
- Portfolio 2: Energy (40%) / Utilities (60%)
- Portfolio 3: Consumer Staples (40%) / Financials (60%)

Updated the .Rmd portfolio chunks to use these pairs (replacing the
placeholders) and re-rendered the notebook. Filled in the Word doc's
objective numeric tables with the resulting values: the Step 2a
mean/SD table, and each portfolio's chosen funds, correlation,
expected return, variance, and standard deviation in Step 4.
Written analysis (Step 3b, Step 5) is untouched for the student to
complete themselves.
</commit_message>
<xml_diff>
--- a/LastName_FirstName_MGMT_3345_U1P.docx
+++ b/LastName_FirstName_MGMT_3345_U1P.docx
@@ -46,21 +46,7 @@
           <w:sz w:val="24"/>
           <w:szCs w:val="24"/>
         </w:rPr>
-        <w:t xml:space="preserve">For this project, you will submit both this completed Word document, Excel file with the data you </w:t>
-      </w:r>
-      <w:r>
-        <w:rPr>
-          <w:sz w:val="24"/>
-          <w:szCs w:val="24"/>
-        </w:rPr>
-        <w:t>calculated</w:t>
-      </w:r>
-      <w:r>
-        <w:rPr>
-          <w:sz w:val="24"/>
-          <w:szCs w:val="24"/>
-        </w:rPr>
-        <w:t xml:space="preserve">, and your R HTML file with </w:t>
+        <w:t xml:space="preserve">For this project, you will submit both this completed Word document, Excel file with the data you calculated, and your R HTML file with </w:t>
       </w:r>
       <w:r>
         <w:rPr>
@@ -140,21 +126,7 @@
           <w:sz w:val="24"/>
           <w:szCs w:val="24"/>
         </w:rPr>
-        <w:t>Check the rubric in Canvas</w:t>
-      </w:r>
-      <w:r>
-        <w:rPr>
-          <w:sz w:val="24"/>
-          <w:szCs w:val="24"/>
-        </w:rPr>
-        <w:t xml:space="preserve"> and at the end of this document</w:t>
-      </w:r>
-      <w:r>
-        <w:rPr>
-          <w:sz w:val="24"/>
-          <w:szCs w:val="24"/>
-        </w:rPr>
-        <w:t xml:space="preserve"> to ensure that you have included all necessary elements.</w:t>
+        <w:t xml:space="preserve">Check the rubric in Canvas and at the end of this document to ensure that you have included all necessary elements.</w:t>
       </w:r>
     </w:p>
     <w:p>
@@ -344,27 +316,7 @@
           <w:szCs w:val="24"/>
           <w:shd w:val="clear" w:color="auto" w:fill="FFFFFF"/>
         </w:rPr>
-        <w:t xml:space="preserve">In this project, you will be examining the Fidelity Sector Mutual Funds below, </w:t>
-      </w:r>
-      <w:r>
-        <w:rPr>
-          <w:rFonts w:cstheme="minorHAnsi"/>
-          <w:color w:val="000000"/>
-          <w:sz w:val="24"/>
-          <w:szCs w:val="24"/>
-          <w:shd w:val="clear" w:color="auto" w:fill="FFFFFF"/>
-        </w:rPr>
-        <w:t xml:space="preserve">calculating real returns, </w:t>
-      </w:r>
-      <w:r>
-        <w:rPr>
-          <w:rFonts w:cstheme="minorHAnsi"/>
-          <w:color w:val="000000"/>
-          <w:sz w:val="24"/>
-          <w:szCs w:val="24"/>
-          <w:shd w:val="clear" w:color="auto" w:fill="FFFFFF"/>
-        </w:rPr>
-        <w:t xml:space="preserve">comparing rates of return, level of risk, and discussing the pros and cons of portfolios using these mutual funds given indicated investment priorities. </w:t>
+        <w:t xml:space="preserve">In this project, you will be examining the Fidelity Sector Mutual Funds below, calculating real returns, comparing rates of return, level of risk, and discussing the pros and cons of portfolios using these mutual funds given indicated investment priorities. </w:t>
       </w:r>
     </w:p>
     <w:p>
@@ -418,27 +370,7 @@
           <w:szCs w:val="24"/>
         </w:rPr>
         <w:lastRenderedPageBreak/>
-        <w:t>Fidelity Sector</w:t>
-      </w:r>
-      <w:r>
-        <w:rPr>
-          <w:rFonts w:cstheme="minorHAnsi"/>
-          <w:b/>
-          <w:bCs/>
-          <w:sz w:val="24"/>
-          <w:szCs w:val="24"/>
-        </w:rPr>
-        <w:t xml:space="preserve"> </w:t>
-      </w:r>
-      <w:r>
-        <w:rPr>
-          <w:rFonts w:cstheme="minorHAnsi"/>
-          <w:b/>
-          <w:bCs/>
-          <w:sz w:val="24"/>
-          <w:szCs w:val="24"/>
-        </w:rPr>
-        <w:t>Mutual Funds</w:t>
+        <w:t xml:space="preserve">Fidelity Sector Mutual Funds</w:t>
       </w:r>
     </w:p>
     <w:p>
@@ -468,39 +400,7 @@
           <w:sz w:val="24"/>
           <w:szCs w:val="24"/>
         </w:rPr>
-        <w:t xml:space="preserve">The following Fidelity Sector Mutual Funds and their </w:t>
-      </w:r>
-      <w:r>
-        <w:rPr>
-          <w:rFonts w:cstheme="minorHAnsi"/>
-          <w:sz w:val="24"/>
-          <w:szCs w:val="24"/>
-        </w:rPr>
-        <w:t>adjusted closing prices for the past 5 years</w:t>
-      </w:r>
-      <w:r>
-        <w:rPr>
-          <w:rFonts w:cstheme="minorHAnsi"/>
-          <w:sz w:val="24"/>
-          <w:szCs w:val="24"/>
-        </w:rPr>
-        <w:t xml:space="preserve"> are shown in the included data set. </w:t>
-      </w:r>
-      <w:r>
-        <w:rPr>
-          <w:rFonts w:cstheme="minorHAnsi"/>
-          <w:sz w:val="24"/>
-          <w:szCs w:val="24"/>
-        </w:rPr>
-        <w:t>If you would like</w:t>
-      </w:r>
-      <w:r>
-        <w:rPr>
-          <w:rFonts w:cstheme="minorHAnsi"/>
-          <w:sz w:val="24"/>
-          <w:szCs w:val="24"/>
-        </w:rPr>
-        <w:t xml:space="preserve"> more information about each of these funds, follow the URL to find which general industries and specific companies are included in each of these mutual funds.</w:t>
+        <w:t xml:space="preserve">The following Fidelity Sector Mutual Funds and their adjusted closing prices for the past 5 years are shown in the included data set. If you would like more information about each of these funds, follow the URL to find which general industries and specific companies are included in each of these mutual funds.</w:t>
       </w:r>
     </w:p>
     <w:p>
@@ -1074,248 +974,148 @@
           <w:u w:val="single"/>
         </w:rPr>
         <w:lastRenderedPageBreak/>
-        <w:t>Step 1</w:t>
-      </w:r>
-      <w:r>
-        <w:rPr>
-          <w:b/>
-          <w:bCs/>
+        <w:t xml:space="preserve">Step 1 – Calculate real returns for each fund based on Consumer Price Index.</w:t>
+      </w:r>
+    </w:p>
+    <w:p>
+      <w:pPr>
+        <w:spacing w:after="0" w:line="240" w:lineRule="auto"/>
+        <w:rPr>
+          <w:sz w:val="24"/>
+          <w:szCs w:val="24"/>
+        </w:rPr>
+      </w:pPr>
+      <w:r>
+        <w:rPr>
+          <w:sz w:val="24"/>
+          <w:szCs w:val="24"/>
+        </w:rPr>
+        <w:t xml:space="preserve">The included Fidelity Excel data file has the monthly adjusted stock price for the last 5 years of six of Fidelity’s Sector Mutual Funds.</w:t>
+      </w:r>
+    </w:p>
+    <w:p>
+      <w:pPr>
+        <w:spacing w:after="0" w:line="240" w:lineRule="auto"/>
+        <w:rPr>
+          <w:sz w:val="24"/>
+          <w:szCs w:val="24"/>
+        </w:rPr>
+      </w:pPr>
+      <w:r>
+        <w:rPr>
+          <w:sz w:val="24"/>
+          <w:szCs w:val="24"/>
+        </w:rPr>
+        <w:t xml:space="preserve">Use the CPI (Consumer Price Index) data provided in the project to deflate the monthly stock prices. Use the resulting data to calculate the real monthly returns for each company (in whole %). (This should result in 58 observations.)</w:t>
+      </w:r>
+    </w:p>
+    <w:p>
+      <w:pPr>
+        <w:spacing w:after="0" w:line="240" w:lineRule="auto"/>
+        <w:rPr>
+          <w:sz w:val="24"/>
+          <w:szCs w:val="24"/>
+        </w:rPr>
+      </w:pPr>
+    </w:p>
+    <w:p>
+      <w:pPr>
+        <w:spacing w:after="0" w:line="240" w:lineRule="auto"/>
+        <w:rPr>
+          <w:b/>
+          <w:bCs/>
+          <w:sz w:val="24"/>
+          <w:szCs w:val="24"/>
+        </w:rPr>
+      </w:pPr>
+      <w:r>
+        <w:rPr>
+          <w:b/>
+          <w:bCs/>
+          <w:sz w:val="24"/>
+          <w:szCs w:val="24"/>
+        </w:rPr>
+        <w:t>*A note about October 2025 CPI</w:t>
+      </w:r>
+    </w:p>
+    <w:p>
+      <w:pPr>
+        <w:spacing w:after="0" w:line="240" w:lineRule="auto"/>
+        <w:rPr>
+          <w:sz w:val="24"/>
+          <w:szCs w:val="24"/>
+        </w:rPr>
+      </w:pPr>
+      <w:r>
+        <w:rPr>
+          <w:sz w:val="24"/>
+          <w:szCs w:val="24"/>
+        </w:rPr>
+        <w:t>The Consumer Price Index (CPI) is released each month by the Bureau of Labor Statistics. Due to the government shutdown, they did not release a CPI for October 2025. However, the Treasury Department needs these index numbers to calculate different payment obligations and therefore used a contingency index (Uniform Offering Circular) of 325.604 for that month. For this project, we will also use that value as the CPI for Oct 2025, but the unknown CPI could vary from this value.</w:t>
+      </w:r>
+    </w:p>
+    <w:p>
+      <w:pPr>
+        <w:spacing w:after="0" w:line="240" w:lineRule="auto"/>
+        <w:rPr>
+          <w:sz w:val="24"/>
+          <w:szCs w:val="24"/>
+        </w:rPr>
+      </w:pPr>
+    </w:p>
+    <w:p>
+      <w:pPr>
+        <w:spacing w:after="0" w:line="240" w:lineRule="auto"/>
+        <w:rPr>
+          <w:sz w:val="24"/>
+          <w:szCs w:val="24"/>
+        </w:rPr>
+      </w:pPr>
+      <w:r>
+        <w:rPr>
+          <w:b/>
+          <w:bCs/>
+          <w:sz w:val="24"/>
+          <w:szCs w:val="24"/>
+        </w:rPr>
+        <w:t>Submission for Step 1:</w:t>
+      </w:r>
+      <w:r>
+        <w:rPr>
+          <w:sz w:val="24"/>
+          <w:szCs w:val="24"/>
+        </w:rPr>
+        <w:t xml:space="preserve"> Copy your 58 calculations for real returns into the blank Excel file provided. You will submit this Excel file with your real returns data as part of your project in Canvas. Import this Excel file into RStudio for the remaining steps of the project.</w:t>
+      </w:r>
+    </w:p>
+    <w:p>
+      <w:pPr>
+        <w:spacing w:after="0" w:line="240" w:lineRule="auto"/>
+        <w:contextualSpacing/>
+        <w:rPr>
+          <w:rFonts w:cstheme="minorHAnsi"/>
+          <w:color w:val="000000"/>
+          <w:sz w:val="24"/>
+          <w:szCs w:val="24"/>
+          <w:shd w:val="clear" w:color="auto" w:fill="FFFFFF"/>
+        </w:rPr>
+      </w:pPr>
+    </w:p>
+    <w:p>
+      <w:pPr>
+        <w:spacing w:after="0" w:line="240" w:lineRule="auto"/>
+        <w:contextualSpacing/>
+        <w:rPr>
+          <w:rFonts w:cstheme="minorHAnsi"/>
+          <w:b/>
+          <w:bCs/>
+          <w:color w:val="000000"/>
           <w:sz w:val="24"/>
           <w:szCs w:val="24"/>
           <w:u w:val="single"/>
-        </w:rPr>
-        <w:t xml:space="preserve"> – Calculate real returns for each fund based on Consumer Price Index.</w:t>
-      </w:r>
-    </w:p>
-    <w:p>
-      <w:pPr>
-        <w:spacing w:after="0" w:line="240" w:lineRule="auto"/>
-        <w:rPr>
-          <w:sz w:val="24"/>
-          <w:szCs w:val="24"/>
-        </w:rPr>
-      </w:pPr>
-      <w:r>
-        <w:rPr>
-          <w:sz w:val="24"/>
-          <w:szCs w:val="24"/>
-        </w:rPr>
-        <w:t xml:space="preserve">The included </w:t>
-      </w:r>
-      <w:r>
-        <w:rPr>
-          <w:sz w:val="24"/>
-          <w:szCs w:val="24"/>
-        </w:rPr>
-        <w:t xml:space="preserve">Fidelity </w:t>
-      </w:r>
-      <w:r>
-        <w:rPr>
-          <w:sz w:val="24"/>
-          <w:szCs w:val="24"/>
-        </w:rPr>
-        <w:t>Excel</w:t>
-      </w:r>
-      <w:r>
-        <w:rPr>
-          <w:sz w:val="24"/>
-          <w:szCs w:val="24"/>
-        </w:rPr>
-        <w:t xml:space="preserve"> </w:t>
-      </w:r>
-      <w:r>
-        <w:rPr>
-          <w:sz w:val="24"/>
-          <w:szCs w:val="24"/>
-        </w:rPr>
-        <w:t xml:space="preserve">data </w:t>
-      </w:r>
-      <w:r>
-        <w:rPr>
-          <w:sz w:val="24"/>
-          <w:szCs w:val="24"/>
-        </w:rPr>
-        <w:t xml:space="preserve">file has the monthly adjusted stock price </w:t>
-      </w:r>
-      <w:r>
-        <w:rPr>
-          <w:sz w:val="24"/>
-          <w:szCs w:val="24"/>
-        </w:rPr>
-        <w:t>for the last 5 years of</w:t>
-      </w:r>
-      <w:r>
-        <w:rPr>
-          <w:sz w:val="24"/>
-          <w:szCs w:val="24"/>
-        </w:rPr>
-        <w:t xml:space="preserve"> six of Fidelity’s Sector Mutual Funds.</w:t>
-      </w:r>
-    </w:p>
-    <w:p>
-      <w:pPr>
-        <w:spacing w:after="0" w:line="240" w:lineRule="auto"/>
-        <w:rPr>
-          <w:sz w:val="24"/>
-          <w:szCs w:val="24"/>
-        </w:rPr>
-      </w:pPr>
-      <w:r>
-        <w:rPr>
-          <w:sz w:val="24"/>
-          <w:szCs w:val="24"/>
-        </w:rPr>
-        <w:t xml:space="preserve">Use the CPI (Consumer Price Index) data provided in the project to deflate the monthly stock prices. Use the resulting data to calculate the real monthly returns for each company (in whole %). (This should result </w:t>
-      </w:r>
-      <w:r>
-        <w:rPr>
-          <w:sz w:val="24"/>
-          <w:szCs w:val="24"/>
-        </w:rPr>
-        <w:t>in 58</w:t>
-      </w:r>
-      <w:r>
-        <w:rPr>
-          <w:sz w:val="24"/>
-          <w:szCs w:val="24"/>
-        </w:rPr>
-        <w:t xml:space="preserve"> observations.)</w:t>
-      </w:r>
-    </w:p>
-    <w:p>
-      <w:pPr>
-        <w:spacing w:after="0" w:line="240" w:lineRule="auto"/>
-        <w:rPr>
-          <w:sz w:val="24"/>
-          <w:szCs w:val="24"/>
-        </w:rPr>
-      </w:pPr>
-    </w:p>
-    <w:p>
-      <w:pPr>
-        <w:spacing w:after="0" w:line="240" w:lineRule="auto"/>
-        <w:rPr>
-          <w:b/>
-          <w:bCs/>
-          <w:sz w:val="24"/>
-          <w:szCs w:val="24"/>
-        </w:rPr>
-      </w:pPr>
-      <w:r>
-        <w:rPr>
-          <w:b/>
-          <w:bCs/>
-          <w:sz w:val="24"/>
-          <w:szCs w:val="24"/>
-        </w:rPr>
-        <w:t>*A note about October 2025 CPI</w:t>
-      </w:r>
-    </w:p>
-    <w:p>
-      <w:pPr>
-        <w:spacing w:after="0" w:line="240" w:lineRule="auto"/>
-        <w:rPr>
-          <w:sz w:val="24"/>
-          <w:szCs w:val="24"/>
-        </w:rPr>
-      </w:pPr>
-      <w:r>
-        <w:rPr>
-          <w:sz w:val="24"/>
-          <w:szCs w:val="24"/>
-        </w:rPr>
-        <w:t>The Consumer Price Index (CPI) is released each month by the Bureau of Labor Statistics. Due to the government shutdown, they did not release a CPI for October 2025. However, the Treasury Department needs these index numbers to calculate different payment obligations and therefore used a contingency index (Uniform Offering Circular) of 325.604 for that month. For this project, we will also use that value as the CPI for Oct 2025, but the unknown CPI could vary from this value.</w:t>
-      </w:r>
-    </w:p>
-    <w:p>
-      <w:pPr>
-        <w:spacing w:after="0" w:line="240" w:lineRule="auto"/>
-        <w:rPr>
-          <w:sz w:val="24"/>
-          <w:szCs w:val="24"/>
-        </w:rPr>
-      </w:pPr>
-    </w:p>
-    <w:p>
-      <w:pPr>
-        <w:spacing w:after="0" w:line="240" w:lineRule="auto"/>
-        <w:rPr>
-          <w:sz w:val="24"/>
-          <w:szCs w:val="24"/>
-        </w:rPr>
-      </w:pPr>
-      <w:r>
-        <w:rPr>
-          <w:b/>
-          <w:bCs/>
-          <w:sz w:val="24"/>
-          <w:szCs w:val="24"/>
-        </w:rPr>
-        <w:t>Submission for Step 1:</w:t>
-      </w:r>
-      <w:r>
-        <w:rPr>
-          <w:sz w:val="24"/>
-          <w:szCs w:val="24"/>
-        </w:rPr>
-        <w:t xml:space="preserve"> </w:t>
-      </w:r>
-      <w:r>
-        <w:rPr>
-          <w:sz w:val="24"/>
-          <w:szCs w:val="24"/>
-        </w:rPr>
-        <w:t xml:space="preserve">Copy your </w:t>
-      </w:r>
-      <w:r>
-        <w:rPr>
-          <w:sz w:val="24"/>
-          <w:szCs w:val="24"/>
-        </w:rPr>
-        <w:t xml:space="preserve">58 </w:t>
-      </w:r>
-      <w:r>
-        <w:rPr>
-          <w:sz w:val="24"/>
-          <w:szCs w:val="24"/>
-        </w:rPr>
-        <w:t>calculations for real returns into the blank Excel file provided</w:t>
-      </w:r>
-      <w:r>
-        <w:rPr>
-          <w:sz w:val="24"/>
-          <w:szCs w:val="24"/>
-        </w:rPr>
-        <w:t xml:space="preserve">. </w:t>
-      </w:r>
-      <w:r>
-        <w:rPr>
-          <w:sz w:val="24"/>
-          <w:szCs w:val="24"/>
-        </w:rPr>
-        <w:t xml:space="preserve">You will submit this Excel file with your </w:t>
-      </w:r>
-      <w:r>
-        <w:rPr>
-          <w:sz w:val="24"/>
-          <w:szCs w:val="24"/>
-        </w:rPr>
-        <w:t xml:space="preserve">real returns </w:t>
-      </w:r>
-      <w:r>
-        <w:rPr>
-          <w:sz w:val="24"/>
-          <w:szCs w:val="24"/>
-        </w:rPr>
-        <w:t>data as part of your project in Canvas.</w:t>
-      </w:r>
-      <w:r>
-        <w:rPr>
-          <w:sz w:val="24"/>
-          <w:szCs w:val="24"/>
-        </w:rPr>
-        <w:t xml:space="preserve"> Import this Excel file into RStudio for the remaining steps of the project.</w:t>
-      </w:r>
+          <w:shd w:val="clear" w:color="auto" w:fill="FFFFFF"/>
+        </w:rPr>
+      </w:pPr>
     </w:p>
     <w:p>
       <w:pPr>
@@ -1323,19 +1123,6 @@
         <w:contextualSpacing/>
         <w:rPr>
           <w:rFonts w:cstheme="minorHAnsi"/>
-          <w:color w:val="000000"/>
-          <w:sz w:val="24"/>
-          <w:szCs w:val="24"/>
-          <w:shd w:val="clear" w:color="auto" w:fill="FFFFFF"/>
-        </w:rPr>
-      </w:pPr>
-    </w:p>
-    <w:p>
-      <w:pPr>
-        <w:spacing w:after="0" w:line="240" w:lineRule="auto"/>
-        <w:contextualSpacing/>
-        <w:rPr>
-          <w:rFonts w:cstheme="minorHAnsi"/>
           <w:b/>
           <w:bCs/>
           <w:color w:val="000000"/>
@@ -1345,11 +1132,7 @@
           <w:shd w:val="clear" w:color="auto" w:fill="FFFFFF"/>
         </w:rPr>
       </w:pPr>
-    </w:p>
-    <w:p>
-      <w:pPr>
-        <w:spacing w:after="0" w:line="240" w:lineRule="auto"/>
-        <w:contextualSpacing/>
+      <w:r>
         <w:rPr>
           <w:rFonts w:cstheme="minorHAnsi"/>
           <w:b/>
@@ -1360,58 +1143,7 @@
           <w:u w:val="single"/>
           <w:shd w:val="clear" w:color="auto" w:fill="FFFFFF"/>
         </w:rPr>
-      </w:pPr>
-      <w:r>
-        <w:rPr>
-          <w:rFonts w:cstheme="minorHAnsi"/>
-          <w:b/>
-          <w:bCs/>
-          <w:color w:val="000000"/>
-          <w:sz w:val="24"/>
-          <w:szCs w:val="24"/>
-          <w:u w:val="single"/>
-          <w:shd w:val="clear" w:color="auto" w:fill="FFFFFF"/>
-        </w:rPr>
-        <w:t>Step 2</w:t>
-      </w:r>
-      <w:r>
-        <w:rPr>
-          <w:rFonts w:cstheme="minorHAnsi"/>
-          <w:b/>
-          <w:bCs/>
-          <w:color w:val="000000"/>
-          <w:sz w:val="24"/>
-          <w:szCs w:val="24"/>
-          <w:u w:val="single"/>
-          <w:shd w:val="clear" w:color="auto" w:fill="FFFFFF"/>
-        </w:rPr>
-        <w:t>a</w:t>
-      </w:r>
-      <w:r>
-        <w:rPr>
-          <w:rFonts w:cstheme="minorHAnsi"/>
-          <w:b/>
-          <w:bCs/>
-          <w:color w:val="000000"/>
-          <w:sz w:val="24"/>
-          <w:szCs w:val="24"/>
-          <w:u w:val="single"/>
-          <w:shd w:val="clear" w:color="auto" w:fill="FFFFFF"/>
-        </w:rPr>
-        <w:t xml:space="preserve"> – C</w:t>
-      </w:r>
-      <w:r>
-        <w:rPr>
-          <w:rFonts w:cstheme="minorHAnsi"/>
-          <w:b/>
-          <w:bCs/>
-          <w:color w:val="000000"/>
-          <w:sz w:val="24"/>
-          <w:szCs w:val="24"/>
-          <w:u w:val="single"/>
-          <w:shd w:val="clear" w:color="auto" w:fill="FFFFFF"/>
-        </w:rPr>
-        <w:t>alculate descriptive statistics for each fund.</w:t>
+        <w:t xml:space="preserve">Step 2a – Calculate descriptive statistics for each fund.</w:t>
       </w:r>
     </w:p>
     <w:p>
@@ -1534,19 +1266,7 @@
                 <w:szCs w:val="24"/>
                 <w:shd w:val="clear" w:color="auto" w:fill="FFFFFF"/>
               </w:rPr>
-              <w:t>Monthly</w:t>
-            </w:r>
-            <w:r>
-              <w:rPr>
-                <w:rFonts w:cstheme="minorHAnsi"/>
-                <w:b/>
-                <w:bCs/>
-                <w:color w:val="000000"/>
-                <w:sz w:val="24"/>
-                <w:szCs w:val="24"/>
-                <w:shd w:val="clear" w:color="auto" w:fill="FFFFFF"/>
-              </w:rPr>
-              <w:t xml:space="preserve"> Return (Mean)</w:t>
+              <w:t xml:space="preserve">Monthly Return (Mean)</w:t>
             </w:r>
           </w:p>
         </w:tc>
@@ -1631,6 +1351,16 @@
                 <w:shd w:val="clear" w:color="auto" w:fill="FFFFFF"/>
               </w:rPr>
             </w:pPr>
+            <w:r>
+              <w:rPr>
+                <w:rFonts w:cstheme="minorHAnsi"/>
+                <w:color w:val="000000"/>
+                <w:sz w:val="24"/>
+                <w:szCs w:val="24"/>
+                <w:shd w:val="clear" w:color="auto" w:fill="FFFFFF"/>
+              </w:rPr>
+              <w:t>0.5021</w:t>
+            </w:r>
           </w:p>
         </w:tc>
         <w:tc>
@@ -1650,6 +1380,16 @@
                 <w:shd w:val="clear" w:color="auto" w:fill="FFFFFF"/>
               </w:rPr>
             </w:pPr>
+            <w:r>
+              <w:rPr>
+                <w:rFonts w:cstheme="minorHAnsi"/>
+                <w:color w:val="000000"/>
+                <w:sz w:val="24"/>
+                <w:szCs w:val="24"/>
+                <w:shd w:val="clear" w:color="auto" w:fill="FFFFFF"/>
+              </w:rPr>
+              <w:t>4.7209</w:t>
+            </w:r>
           </w:p>
         </w:tc>
       </w:tr>
@@ -1700,6 +1440,16 @@
                 <w:shd w:val="clear" w:color="auto" w:fill="FFFFFF"/>
               </w:rPr>
             </w:pPr>
+            <w:r>
+              <w:rPr>
+                <w:rFonts w:cstheme="minorHAnsi"/>
+                <w:color w:val="000000"/>
+                <w:sz w:val="24"/>
+                <w:szCs w:val="24"/>
+                <w:shd w:val="clear" w:color="auto" w:fill="FFFFFF"/>
+              </w:rPr>
+              <w:t>1.3632</w:t>
+            </w:r>
           </w:p>
         </w:tc>
         <w:tc>
@@ -1719,6 +1469,16 @@
                 <w:shd w:val="clear" w:color="auto" w:fill="FFFFFF"/>
               </w:rPr>
             </w:pPr>
+            <w:r>
+              <w:rPr>
+                <w:rFonts w:cstheme="minorHAnsi"/>
+                <w:color w:val="000000"/>
+                <w:sz w:val="24"/>
+                <w:szCs w:val="24"/>
+                <w:shd w:val="clear" w:color="auto" w:fill="FFFFFF"/>
+              </w:rPr>
+              <w:t>7.2890</w:t>
+            </w:r>
           </w:p>
         </w:tc>
       </w:tr>
@@ -1769,6 +1529,16 @@
                 <w:shd w:val="clear" w:color="auto" w:fill="FFFFFF"/>
               </w:rPr>
             </w:pPr>
+            <w:r>
+              <w:rPr>
+                <w:rFonts w:cstheme="minorHAnsi"/>
+                <w:color w:val="000000"/>
+                <w:sz w:val="24"/>
+                <w:szCs w:val="24"/>
+                <w:shd w:val="clear" w:color="auto" w:fill="FFFFFF"/>
+              </w:rPr>
+              <w:t>1.2556</w:t>
+            </w:r>
           </w:p>
         </w:tc>
         <w:tc>
@@ -1788,6 +1558,16 @@
                 <w:shd w:val="clear" w:color="auto" w:fill="FFFFFF"/>
               </w:rPr>
             </w:pPr>
+            <w:r>
+              <w:rPr>
+                <w:rFonts w:cstheme="minorHAnsi"/>
+                <w:color w:val="000000"/>
+                <w:sz w:val="24"/>
+                <w:szCs w:val="24"/>
+                <w:shd w:val="clear" w:color="auto" w:fill="FFFFFF"/>
+              </w:rPr>
+              <w:t>7.0954</w:t>
+            </w:r>
           </w:p>
         </w:tc>
       </w:tr>
@@ -1838,6 +1618,16 @@
                 <w:shd w:val="clear" w:color="auto" w:fill="FFFFFF"/>
               </w:rPr>
             </w:pPr>
+            <w:r>
+              <w:rPr>
+                <w:rFonts w:cstheme="minorHAnsi"/>
+                <w:color w:val="000000"/>
+                <w:sz w:val="24"/>
+                <w:szCs w:val="24"/>
+                <w:shd w:val="clear" w:color="auto" w:fill="FFFFFF"/>
+              </w:rPr>
+              <w:t>0.4112</w:t>
+            </w:r>
           </w:p>
         </w:tc>
         <w:tc>
@@ -1857,6 +1647,16 @@
                 <w:shd w:val="clear" w:color="auto" w:fill="FFFFFF"/>
               </w:rPr>
             </w:pPr>
+            <w:r>
+              <w:rPr>
+                <w:rFonts w:cstheme="minorHAnsi"/>
+                <w:color w:val="000000"/>
+                <w:sz w:val="24"/>
+                <w:szCs w:val="24"/>
+                <w:shd w:val="clear" w:color="auto" w:fill="FFFFFF"/>
+              </w:rPr>
+              <w:t>5.5297</w:t>
+            </w:r>
           </w:p>
         </w:tc>
       </w:tr>
@@ -1907,6 +1707,16 @@
                 <w:shd w:val="clear" w:color="auto" w:fill="FFFFFF"/>
               </w:rPr>
             </w:pPr>
+            <w:r>
+              <w:rPr>
+                <w:rFonts w:cstheme="minorHAnsi"/>
+                <w:color w:val="000000"/>
+                <w:sz w:val="24"/>
+                <w:szCs w:val="24"/>
+                <w:shd w:val="clear" w:color="auto" w:fill="FFFFFF"/>
+              </w:rPr>
+              <w:t>1.6394</w:t>
+            </w:r>
           </w:p>
         </w:tc>
         <w:tc>
@@ -1926,6 +1736,16 @@
                 <w:shd w:val="clear" w:color="auto" w:fill="FFFFFF"/>
               </w:rPr>
             </w:pPr>
+            <w:r>
+              <w:rPr>
+                <w:rFonts w:cstheme="minorHAnsi"/>
+                <w:color w:val="000000"/>
+                <w:sz w:val="24"/>
+                <w:szCs w:val="24"/>
+                <w:shd w:val="clear" w:color="auto" w:fill="FFFFFF"/>
+              </w:rPr>
+              <w:t>7.4317</w:t>
+            </w:r>
           </w:p>
         </w:tc>
       </w:tr>
@@ -1976,6 +1796,16 @@
                 <w:shd w:val="clear" w:color="auto" w:fill="FFFFFF"/>
               </w:rPr>
             </w:pPr>
+            <w:r>
+              <w:rPr>
+                <w:rFonts w:cstheme="minorHAnsi"/>
+                <w:color w:val="000000"/>
+                <w:sz w:val="24"/>
+                <w:szCs w:val="24"/>
+                <w:shd w:val="clear" w:color="auto" w:fill="FFFFFF"/>
+              </w:rPr>
+              <w:t>1.0573</w:t>
+            </w:r>
           </w:p>
         </w:tc>
         <w:tc>
@@ -1995,6 +1825,16 @@
                 <w:shd w:val="clear" w:color="auto" w:fill="FFFFFF"/>
               </w:rPr>
             </w:pPr>
+            <w:r>
+              <w:rPr>
+                <w:rFonts w:cstheme="minorHAnsi"/>
+                <w:color w:val="000000"/>
+                <w:sz w:val="24"/>
+                <w:szCs w:val="24"/>
+                <w:shd w:val="clear" w:color="auto" w:fill="FFFFFF"/>
+              </w:rPr>
+              <w:t>5.3919</w:t>
+            </w:r>
           </w:p>
         </w:tc>
       </w:tr>
@@ -2042,9 +1882,214 @@
           <w:u w:val="single"/>
           <w:shd w:val="clear" w:color="auto" w:fill="FFFFFF"/>
         </w:rPr>
-        <w:t xml:space="preserve">RStudio </w:t>
-      </w:r>
-      <w:r>
+        <w:t xml:space="preserve">RStudio Codes</w:t>
+      </w:r>
+    </w:p>
+    <w:p>
+      <w:pPr>
+        <w:spacing w:line="278" w:lineRule="auto"/>
+        <w:rPr>
+          <w:rFonts w:cstheme="minorHAnsi"/>
+          <w:color w:val="000000"/>
+          <w:sz w:val="24"/>
+          <w:szCs w:val="24"/>
+          <w:shd w:val="clear" w:color="auto" w:fill="FFFFFF"/>
+        </w:rPr>
+      </w:pPr>
+      <w:r>
+        <w:rPr>
+          <w:rFonts w:cstheme="minorHAnsi"/>
+          <w:color w:val="000000"/>
+          <w:sz w:val="24"/>
+          <w:szCs w:val="24"/>
+          <w:shd w:val="clear" w:color="auto" w:fill="FFFFFF"/>
+        </w:rPr>
+        <w:t xml:space="preserve">The RStudio codes for basic descriptive statistics can be found in the Chapter 3A worksheet of the Business Statistics All R Code Excel file in the Welcome module on our Canvas home page, but here are the ones you will need for this project:</w:t>
+      </w:r>
+    </w:p>
+    <w:p>
+      <w:pPr>
+        <w:spacing w:after="0" w:line="278" w:lineRule="auto"/>
+        <w:rPr>
+          <w:rFonts w:cstheme="minorHAnsi"/>
+          <w:b/>
+          <w:bCs/>
+          <w:color w:val="000000"/>
+          <w:sz w:val="24"/>
+          <w:szCs w:val="24"/>
+          <w:shd w:val="clear" w:color="auto" w:fill="FFFFFF"/>
+        </w:rPr>
+      </w:pPr>
+      <w:r>
+        <w:rPr>
+          <w:rFonts w:cstheme="minorHAnsi"/>
+          <w:b/>
+          <w:bCs/>
+          <w:color w:val="000000"/>
+          <w:sz w:val="24"/>
+          <w:szCs w:val="24"/>
+          <w:shd w:val="clear" w:color="auto" w:fill="FFFFFF"/>
+        </w:rPr>
+        <w:t>mean</w:t>
+      </w:r>
+    </w:p>
+    <w:p>
+      <w:pPr>
+        <w:spacing w:after="0" w:line="278" w:lineRule="auto"/>
+        <w:rPr>
+          <w:rFonts w:cstheme="minorHAnsi"/>
+          <w:color w:val="000000"/>
+          <w:sz w:val="24"/>
+          <w:szCs w:val="24"/>
+          <w:shd w:val="clear" w:color="auto" w:fill="FFFFFF"/>
+        </w:rPr>
+      </w:pPr>
+      <w:r>
+        <w:rPr>
+          <w:rFonts w:cstheme="minorHAnsi"/>
+          <w:color w:val="000000"/>
+          <w:sz w:val="24"/>
+          <w:szCs w:val="24"/>
+          <w:shd w:val="clear" w:color="auto" w:fill="FFFFFF"/>
+        </w:rPr>
+        <w:t>mean(df$var)</w:t>
+      </w:r>
+    </w:p>
+    <w:p>
+      <w:pPr>
+        <w:spacing w:after="0" w:line="278" w:lineRule="auto"/>
+        <w:rPr>
+          <w:rFonts w:cstheme="minorHAnsi"/>
+          <w:color w:val="000000"/>
+          <w:sz w:val="24"/>
+          <w:szCs w:val="24"/>
+          <w:shd w:val="clear" w:color="auto" w:fill="FFFFFF"/>
+        </w:rPr>
+      </w:pPr>
+    </w:p>
+    <w:p>
+      <w:pPr>
+        <w:spacing w:after="0" w:line="278" w:lineRule="auto"/>
+        <w:rPr>
+          <w:rFonts w:cstheme="minorHAnsi"/>
+          <w:b/>
+          <w:bCs/>
+          <w:color w:val="000000"/>
+          <w:sz w:val="24"/>
+          <w:szCs w:val="24"/>
+          <w:shd w:val="clear" w:color="auto" w:fill="FFFFFF"/>
+        </w:rPr>
+      </w:pPr>
+      <w:r>
+        <w:rPr>
+          <w:rFonts w:cstheme="minorHAnsi"/>
+          <w:b/>
+          <w:bCs/>
+          <w:color w:val="000000"/>
+          <w:sz w:val="24"/>
+          <w:szCs w:val="24"/>
+          <w:shd w:val="clear" w:color="auto" w:fill="FFFFFF"/>
+        </w:rPr>
+        <w:t>standard deviation</w:t>
+      </w:r>
+    </w:p>
+    <w:p>
+      <w:pPr>
+        <w:spacing w:after="0" w:line="278" w:lineRule="auto"/>
+        <w:rPr>
+          <w:rFonts w:cstheme="minorHAnsi"/>
+          <w:color w:val="000000"/>
+          <w:sz w:val="24"/>
+          <w:szCs w:val="24"/>
+          <w:shd w:val="clear" w:color="auto" w:fill="FFFFFF"/>
+        </w:rPr>
+      </w:pPr>
+      <w:r>
+        <w:rPr>
+          <w:rFonts w:cstheme="minorHAnsi"/>
+          <w:color w:val="000000"/>
+          <w:sz w:val="24"/>
+          <w:szCs w:val="24"/>
+          <w:shd w:val="clear" w:color="auto" w:fill="FFFFFF"/>
+        </w:rPr>
+        <w:t>sd(df$var)</w:t>
+      </w:r>
+    </w:p>
+    <w:p>
+      <w:pPr>
+        <w:spacing w:after="0" w:line="278" w:lineRule="auto"/>
+        <w:rPr>
+          <w:rFonts w:cstheme="minorHAnsi"/>
+          <w:color w:val="000000"/>
+          <w:sz w:val="24"/>
+          <w:szCs w:val="24"/>
+          <w:shd w:val="clear" w:color="auto" w:fill="FFFFFF"/>
+        </w:rPr>
+      </w:pPr>
+    </w:p>
+    <w:p>
+      <w:pPr>
+        <w:spacing w:after="0" w:line="278" w:lineRule="auto"/>
+        <w:rPr>
+          <w:rFonts w:cstheme="minorHAnsi"/>
+          <w:b/>
+          <w:bCs/>
+          <w:color w:val="000000"/>
+          <w:sz w:val="24"/>
+          <w:szCs w:val="24"/>
+          <w:shd w:val="clear" w:color="auto" w:fill="FFFFFF"/>
+        </w:rPr>
+      </w:pPr>
+      <w:r>
+        <w:rPr>
+          <w:rFonts w:cstheme="minorHAnsi"/>
+          <w:b/>
+          <w:bCs/>
+          <w:color w:val="000000"/>
+          <w:sz w:val="24"/>
+          <w:szCs w:val="24"/>
+          <w:shd w:val="clear" w:color="auto" w:fill="FFFFFF"/>
+        </w:rPr>
+        <w:t>correlation coefficient</w:t>
+      </w:r>
+    </w:p>
+    <w:p>
+      <w:pPr>
+        <w:spacing w:after="0" w:line="278" w:lineRule="auto"/>
+        <w:rPr>
+          <w:rFonts w:cstheme="minorHAnsi"/>
+          <w:color w:val="000000"/>
+          <w:sz w:val="24"/>
+          <w:szCs w:val="24"/>
+          <w:shd w:val="clear" w:color="auto" w:fill="FFFFFF"/>
+        </w:rPr>
+      </w:pPr>
+      <w:r>
+        <w:rPr>
+          <w:rFonts w:cstheme="minorHAnsi"/>
+          <w:color w:val="000000"/>
+          <w:sz w:val="24"/>
+          <w:szCs w:val="24"/>
+          <w:shd w:val="clear" w:color="auto" w:fill="FFFFFF"/>
+        </w:rPr>
+        <w:t>cor(df$var, df$var)</w:t>
+      </w:r>
+    </w:p>
+    <w:p>
+      <w:pPr>
+        <w:spacing w:after="0" w:line="278" w:lineRule="auto"/>
+        <w:rPr>
+          <w:rFonts w:cstheme="minorHAnsi"/>
+          <w:color w:val="000000"/>
+          <w:sz w:val="24"/>
+          <w:szCs w:val="24"/>
+          <w:shd w:val="clear" w:color="auto" w:fill="FFFFFF"/>
+        </w:rPr>
+      </w:pPr>
+    </w:p>
+    <w:p>
+      <w:pPr>
+        <w:spacing w:after="0" w:line="278" w:lineRule="auto"/>
         <w:rPr>
           <w:rFonts w:cstheme="minorHAnsi"/>
           <w:b/>
@@ -2055,585 +2100,159 @@
           <w:u w:val="single"/>
           <w:shd w:val="clear" w:color="auto" w:fill="FFFFFF"/>
         </w:rPr>
-        <w:t>Codes</w:t>
-      </w:r>
-    </w:p>
-    <w:p>
-      <w:pPr>
-        <w:spacing w:line="278" w:lineRule="auto"/>
-        <w:rPr>
-          <w:rFonts w:cstheme="minorHAnsi"/>
-          <w:color w:val="000000"/>
-          <w:sz w:val="24"/>
-          <w:szCs w:val="24"/>
-          <w:shd w:val="clear" w:color="auto" w:fill="FFFFFF"/>
-        </w:rPr>
-      </w:pPr>
-      <w:r>
-        <w:rPr>
-          <w:rFonts w:cstheme="minorHAnsi"/>
-          <w:color w:val="000000"/>
-          <w:sz w:val="24"/>
-          <w:szCs w:val="24"/>
-          <w:shd w:val="clear" w:color="auto" w:fill="FFFFFF"/>
-        </w:rPr>
-        <w:t>The RStudio codes for basic descriptive statistics can be found in</w:t>
-      </w:r>
-      <w:r>
-        <w:rPr>
-          <w:rFonts w:cstheme="minorHAnsi"/>
-          <w:color w:val="000000"/>
-          <w:sz w:val="24"/>
-          <w:szCs w:val="24"/>
-          <w:shd w:val="clear" w:color="auto" w:fill="FFFFFF"/>
-        </w:rPr>
-        <w:t xml:space="preserve"> the Chapter 3A worksheet of the </w:t>
-      </w:r>
-      <w:r>
-        <w:rPr>
-          <w:rFonts w:cstheme="minorHAnsi"/>
-          <w:color w:val="000000"/>
-          <w:sz w:val="24"/>
-          <w:szCs w:val="24"/>
-          <w:shd w:val="clear" w:color="auto" w:fill="FFFFFF"/>
-        </w:rPr>
-        <w:t xml:space="preserve">Business Statistics </w:t>
-      </w:r>
-      <w:r>
-        <w:rPr>
-          <w:rFonts w:cstheme="minorHAnsi"/>
-          <w:color w:val="000000"/>
-          <w:sz w:val="24"/>
-          <w:szCs w:val="24"/>
-          <w:shd w:val="clear" w:color="auto" w:fill="FFFFFF"/>
-        </w:rPr>
-        <w:t>All R Code Excel file in the Welcome module on our Canvas home page, but here are the ones you will need for this project:</w:t>
-      </w:r>
+      </w:pPr>
+      <w:r>
+        <w:rPr>
+          <w:rFonts w:cstheme="minorHAnsi"/>
+          <w:b/>
+          <w:bCs/>
+          <w:color w:val="000000"/>
+          <w:sz w:val="24"/>
+          <w:szCs w:val="24"/>
+          <w:u w:val="single"/>
+          <w:shd w:val="clear" w:color="auto" w:fill="FFFFFF"/>
+        </w:rPr>
+        <w:br w:type="page"/>
+      </w:r>
+    </w:p>
+    <w:p>
+      <w:pPr>
+        <w:spacing w:after="0" w:line="240" w:lineRule="auto"/>
+        <w:contextualSpacing/>
+        <w:rPr>
+          <w:rFonts w:cstheme="minorHAnsi"/>
+          <w:b/>
+          <w:bCs/>
+          <w:color w:val="000000"/>
+          <w:sz w:val="24"/>
+          <w:szCs w:val="24"/>
+          <w:u w:val="single"/>
+          <w:shd w:val="clear" w:color="auto" w:fill="FFFFFF"/>
+        </w:rPr>
+      </w:pPr>
+      <w:r>
+        <w:rPr>
+          <w:rFonts w:cstheme="minorHAnsi"/>
+          <w:b/>
+          <w:bCs/>
+          <w:color w:val="000000"/>
+          <w:sz w:val="24"/>
+          <w:szCs w:val="24"/>
+          <w:u w:val="single"/>
+          <w:shd w:val="clear" w:color="auto" w:fill="FFFFFF"/>
+        </w:rPr>
+        <w:lastRenderedPageBreak/>
+        <w:t xml:space="preserve">Step 3a – Create a line graph for each of the mutual funds.</w:t>
+      </w:r>
+    </w:p>
+    <w:p>
+      <w:pPr>
+        <w:spacing w:after="0" w:line="240" w:lineRule="auto"/>
+        <w:contextualSpacing/>
+        <w:rPr>
+          <w:rFonts w:cstheme="minorHAnsi"/>
+          <w:color w:val="000000"/>
+          <w:sz w:val="24"/>
+          <w:szCs w:val="24"/>
+          <w:shd w:val="clear" w:color="auto" w:fill="FFFFFF"/>
+        </w:rPr>
+      </w:pPr>
+    </w:p>
+    <w:p>
+      <w:pPr>
+        <w:spacing w:after="0" w:line="240" w:lineRule="auto"/>
+        <w:contextualSpacing/>
+        <w:rPr>
+          <w:rFonts w:cstheme="minorHAnsi"/>
+          <w:color w:val="000000"/>
+          <w:sz w:val="24"/>
+          <w:szCs w:val="24"/>
+          <w:shd w:val="clear" w:color="auto" w:fill="FFFFFF"/>
+        </w:rPr>
+      </w:pPr>
+      <w:r>
+        <w:rPr>
+          <w:rFonts w:cstheme="minorHAnsi"/>
+          <w:color w:val="000000"/>
+          <w:sz w:val="24"/>
+          <w:szCs w:val="24"/>
+          <w:shd w:val="clear" w:color="auto" w:fill="FFFFFF"/>
+        </w:rPr>
+        <w:t xml:space="preserve">Create a line graph of yearly real returns for each mutual fund. Make sure to include appropriate and professional titles and axes labels. </w:t>
+      </w:r>
+      <w:r>
+        <w:rPr>
+          <w:rFonts w:cstheme="minorHAnsi"/>
+          <w:color w:val="156082" w:themeColor="accent1"/>
+          <w:sz w:val="24"/>
+          <w:szCs w:val="24"/>
+          <w:shd w:val="clear" w:color="auto" w:fill="FFFFFF"/>
+        </w:rPr>
+        <w:t xml:space="preserve">Please copy and paste </w:t>
+      </w:r>
+      <w:r>
+        <w:rPr>
+          <w:rFonts w:cstheme="minorHAnsi"/>
+          <w:color w:val="156082" w:themeColor="accent1"/>
+          <w:sz w:val="24"/>
+          <w:szCs w:val="24"/>
+          <w:u w:val="single"/>
+          <w:shd w:val="clear" w:color="auto" w:fill="FFFFFF"/>
+        </w:rPr>
+        <w:t xml:space="preserve">all 6 line graphs</w:t>
+      </w:r>
+      <w:r>
+        <w:rPr>
+          <w:rFonts w:cstheme="minorHAnsi"/>
+          <w:color w:val="156082" w:themeColor="accent1"/>
+          <w:sz w:val="24"/>
+          <w:szCs w:val="24"/>
+          <w:shd w:val="clear" w:color="auto" w:fill="FFFFFF"/>
+        </w:rPr>
+        <w:t xml:space="preserve"> here in the Word document for easier grading.</w:t>
+      </w:r>
+    </w:p>
+    <w:p>
+      <w:pPr>
+        <w:spacing w:after="0" w:line="240" w:lineRule="auto"/>
+        <w:rPr>
+          <w:sz w:val="24"/>
+          <w:szCs w:val="24"/>
+        </w:rPr>
+      </w:pPr>
     </w:p>
     <w:p>
       <w:pPr>
         <w:spacing w:after="0" w:line="278" w:lineRule="auto"/>
         <w:rPr>
           <w:rFonts w:cstheme="minorHAnsi"/>
-          <w:b/>
-          <w:bCs/>
-          <w:color w:val="000000"/>
-          <w:sz w:val="24"/>
-          <w:szCs w:val="24"/>
-          <w:shd w:val="clear" w:color="auto" w:fill="FFFFFF"/>
-        </w:rPr>
-      </w:pPr>
-      <w:r>
-        <w:rPr>
-          <w:rFonts w:cstheme="minorHAnsi"/>
-          <w:b/>
-          <w:bCs/>
-          <w:color w:val="000000"/>
-          <w:sz w:val="24"/>
-          <w:szCs w:val="24"/>
-          <w:shd w:val="clear" w:color="auto" w:fill="FFFFFF"/>
-        </w:rPr>
-        <w:t>mean</w:t>
-      </w:r>
-    </w:p>
-    <w:p>
-      <w:pPr>
-        <w:spacing w:after="0" w:line="278" w:lineRule="auto"/>
-        <w:rPr>
-          <w:rFonts w:cstheme="minorHAnsi"/>
-          <w:color w:val="000000"/>
-          <w:sz w:val="24"/>
-          <w:szCs w:val="24"/>
-          <w:shd w:val="clear" w:color="auto" w:fill="FFFFFF"/>
-        </w:rPr>
-      </w:pPr>
-      <w:r>
-        <w:rPr>
-          <w:rFonts w:cstheme="minorHAnsi"/>
-          <w:color w:val="000000"/>
-          <w:sz w:val="24"/>
-          <w:szCs w:val="24"/>
-          <w:shd w:val="clear" w:color="auto" w:fill="FFFFFF"/>
-        </w:rPr>
-        <w:t>mean(df$var)</w:t>
-      </w:r>
-    </w:p>
-    <w:p>
-      <w:pPr>
-        <w:spacing w:after="0" w:line="278" w:lineRule="auto"/>
-        <w:rPr>
-          <w:rFonts w:cstheme="minorHAnsi"/>
-          <w:color w:val="000000"/>
-          <w:sz w:val="24"/>
-          <w:szCs w:val="24"/>
-          <w:shd w:val="clear" w:color="auto" w:fill="FFFFFF"/>
-        </w:rPr>
-      </w:pPr>
-    </w:p>
-    <w:p>
-      <w:pPr>
-        <w:spacing w:after="0" w:line="278" w:lineRule="auto"/>
-        <w:rPr>
-          <w:rFonts w:cstheme="minorHAnsi"/>
-          <w:b/>
-          <w:bCs/>
-          <w:color w:val="000000"/>
-          <w:sz w:val="24"/>
-          <w:szCs w:val="24"/>
-          <w:shd w:val="clear" w:color="auto" w:fill="FFFFFF"/>
-        </w:rPr>
-      </w:pPr>
-      <w:r>
-        <w:rPr>
-          <w:rFonts w:cstheme="minorHAnsi"/>
-          <w:b/>
-          <w:bCs/>
-          <w:color w:val="000000"/>
-          <w:sz w:val="24"/>
-          <w:szCs w:val="24"/>
-          <w:shd w:val="clear" w:color="auto" w:fill="FFFFFF"/>
-        </w:rPr>
-        <w:t>standard deviation</w:t>
-      </w:r>
-    </w:p>
-    <w:p>
-      <w:pPr>
-        <w:spacing w:after="0" w:line="278" w:lineRule="auto"/>
-        <w:rPr>
-          <w:rFonts w:cstheme="minorHAnsi"/>
-          <w:color w:val="000000"/>
-          <w:sz w:val="24"/>
-          <w:szCs w:val="24"/>
-          <w:shd w:val="clear" w:color="auto" w:fill="FFFFFF"/>
-        </w:rPr>
-      </w:pPr>
-      <w:r>
-        <w:rPr>
-          <w:rFonts w:cstheme="minorHAnsi"/>
-          <w:color w:val="000000"/>
-          <w:sz w:val="24"/>
-          <w:szCs w:val="24"/>
-          <w:shd w:val="clear" w:color="auto" w:fill="FFFFFF"/>
-        </w:rPr>
-        <w:t>sd(df$var)</w:t>
-      </w:r>
-    </w:p>
-    <w:p>
-      <w:pPr>
-        <w:spacing w:after="0" w:line="278" w:lineRule="auto"/>
-        <w:rPr>
-          <w:rFonts w:cstheme="minorHAnsi"/>
-          <w:color w:val="000000"/>
-          <w:sz w:val="24"/>
-          <w:szCs w:val="24"/>
-          <w:shd w:val="clear" w:color="auto" w:fill="FFFFFF"/>
-        </w:rPr>
-      </w:pPr>
-    </w:p>
-    <w:p>
-      <w:pPr>
-        <w:spacing w:after="0" w:line="278" w:lineRule="auto"/>
-        <w:rPr>
-          <w:rFonts w:cstheme="minorHAnsi"/>
-          <w:b/>
-          <w:bCs/>
-          <w:color w:val="000000"/>
-          <w:sz w:val="24"/>
-          <w:szCs w:val="24"/>
-          <w:shd w:val="clear" w:color="auto" w:fill="FFFFFF"/>
-        </w:rPr>
-      </w:pPr>
-      <w:r>
-        <w:rPr>
-          <w:rFonts w:cstheme="minorHAnsi"/>
-          <w:b/>
-          <w:bCs/>
-          <w:color w:val="000000"/>
-          <w:sz w:val="24"/>
-          <w:szCs w:val="24"/>
-          <w:shd w:val="clear" w:color="auto" w:fill="FFFFFF"/>
-        </w:rPr>
-        <w:t>correlation coefficient</w:t>
-      </w:r>
-    </w:p>
-    <w:p>
-      <w:pPr>
-        <w:spacing w:after="0" w:line="278" w:lineRule="auto"/>
-        <w:rPr>
-          <w:rFonts w:cstheme="minorHAnsi"/>
-          <w:color w:val="000000"/>
-          <w:sz w:val="24"/>
-          <w:szCs w:val="24"/>
-          <w:shd w:val="clear" w:color="auto" w:fill="FFFFFF"/>
-        </w:rPr>
-      </w:pPr>
-      <w:r>
-        <w:rPr>
-          <w:rFonts w:cstheme="minorHAnsi"/>
-          <w:color w:val="000000"/>
-          <w:sz w:val="24"/>
-          <w:szCs w:val="24"/>
-          <w:shd w:val="clear" w:color="auto" w:fill="FFFFFF"/>
-        </w:rPr>
-        <w:t>cor(df$var, df$var)</w:t>
-      </w:r>
-    </w:p>
-    <w:p>
-      <w:pPr>
-        <w:spacing w:after="0" w:line="278" w:lineRule="auto"/>
-        <w:rPr>
-          <w:rFonts w:cstheme="minorHAnsi"/>
-          <w:color w:val="000000"/>
-          <w:sz w:val="24"/>
-          <w:szCs w:val="24"/>
-          <w:shd w:val="clear" w:color="auto" w:fill="FFFFFF"/>
-        </w:rPr>
-      </w:pPr>
-    </w:p>
-    <w:p>
-      <w:pPr>
-        <w:spacing w:after="0" w:line="278" w:lineRule="auto"/>
-        <w:rPr>
-          <w:rFonts w:cstheme="minorHAnsi"/>
-          <w:b/>
-          <w:bCs/>
-          <w:color w:val="000000"/>
-          <w:sz w:val="24"/>
-          <w:szCs w:val="24"/>
-          <w:u w:val="single"/>
-          <w:shd w:val="clear" w:color="auto" w:fill="FFFFFF"/>
-        </w:rPr>
-      </w:pPr>
-      <w:r>
-        <w:rPr>
-          <w:rFonts w:cstheme="minorHAnsi"/>
-          <w:b/>
-          <w:bCs/>
-          <w:color w:val="000000"/>
-          <w:sz w:val="24"/>
-          <w:szCs w:val="24"/>
-          <w:u w:val="single"/>
-          <w:shd w:val="clear" w:color="auto" w:fill="FFFFFF"/>
-        </w:rPr>
-        <w:br w:type="page"/>
-      </w:r>
-    </w:p>
-    <w:p>
-      <w:pPr>
-        <w:spacing w:after="0" w:line="240" w:lineRule="auto"/>
-        <w:contextualSpacing/>
-        <w:rPr>
-          <w:rFonts w:cstheme="minorHAnsi"/>
-          <w:b/>
-          <w:bCs/>
-          <w:color w:val="000000"/>
-          <w:sz w:val="24"/>
-          <w:szCs w:val="24"/>
-          <w:u w:val="single"/>
-          <w:shd w:val="clear" w:color="auto" w:fill="FFFFFF"/>
-        </w:rPr>
-      </w:pPr>
-      <w:r>
-        <w:rPr>
-          <w:rFonts w:cstheme="minorHAnsi"/>
-          <w:b/>
-          <w:bCs/>
-          <w:color w:val="000000"/>
-          <w:sz w:val="24"/>
-          <w:szCs w:val="24"/>
-          <w:u w:val="single"/>
-          <w:shd w:val="clear" w:color="auto" w:fill="FFFFFF"/>
-        </w:rPr>
-        <w:lastRenderedPageBreak/>
-        <w:t xml:space="preserve">Step </w:t>
-      </w:r>
-      <w:r>
-        <w:rPr>
-          <w:rFonts w:cstheme="minorHAnsi"/>
-          <w:b/>
-          <w:bCs/>
-          <w:color w:val="000000"/>
-          <w:sz w:val="24"/>
-          <w:szCs w:val="24"/>
-          <w:u w:val="single"/>
-          <w:shd w:val="clear" w:color="auto" w:fill="FFFFFF"/>
-        </w:rPr>
-        <w:t>3a</w:t>
-      </w:r>
-      <w:r>
-        <w:rPr>
-          <w:rFonts w:cstheme="minorHAnsi"/>
-          <w:b/>
-          <w:bCs/>
-          <w:color w:val="000000"/>
-          <w:sz w:val="24"/>
-          <w:szCs w:val="24"/>
-          <w:u w:val="single"/>
-          <w:shd w:val="clear" w:color="auto" w:fill="FFFFFF"/>
-        </w:rPr>
-        <w:t xml:space="preserve"> – Create a </w:t>
-      </w:r>
-      <w:r>
-        <w:rPr>
-          <w:rFonts w:cstheme="minorHAnsi"/>
-          <w:b/>
-          <w:bCs/>
-          <w:color w:val="000000"/>
-          <w:sz w:val="24"/>
-          <w:szCs w:val="24"/>
-          <w:u w:val="single"/>
-          <w:shd w:val="clear" w:color="auto" w:fill="FFFFFF"/>
-        </w:rPr>
-        <w:t>line graph</w:t>
-      </w:r>
-      <w:r>
-        <w:rPr>
-          <w:rFonts w:cstheme="minorHAnsi"/>
-          <w:b/>
-          <w:bCs/>
-          <w:color w:val="000000"/>
-          <w:sz w:val="24"/>
-          <w:szCs w:val="24"/>
-          <w:u w:val="single"/>
-          <w:shd w:val="clear" w:color="auto" w:fill="FFFFFF"/>
-        </w:rPr>
-        <w:t xml:space="preserve"> for each of the mutual funds.</w:t>
-      </w:r>
-    </w:p>
-    <w:p>
-      <w:pPr>
-        <w:spacing w:after="0" w:line="240" w:lineRule="auto"/>
-        <w:contextualSpacing/>
-        <w:rPr>
-          <w:rFonts w:cstheme="minorHAnsi"/>
-          <w:color w:val="000000"/>
-          <w:sz w:val="24"/>
-          <w:szCs w:val="24"/>
-          <w:shd w:val="clear" w:color="auto" w:fill="FFFFFF"/>
-        </w:rPr>
-      </w:pPr>
-    </w:p>
-    <w:p>
-      <w:pPr>
-        <w:spacing w:after="0" w:line="240" w:lineRule="auto"/>
-        <w:contextualSpacing/>
-        <w:rPr>
-          <w:rFonts w:cstheme="minorHAnsi"/>
-          <w:color w:val="000000"/>
-          <w:sz w:val="24"/>
-          <w:szCs w:val="24"/>
-          <w:shd w:val="clear" w:color="auto" w:fill="FFFFFF"/>
-        </w:rPr>
-      </w:pPr>
-      <w:r>
-        <w:rPr>
-          <w:rFonts w:cstheme="minorHAnsi"/>
-          <w:color w:val="000000"/>
-          <w:sz w:val="24"/>
-          <w:szCs w:val="24"/>
-          <w:shd w:val="clear" w:color="auto" w:fill="FFFFFF"/>
-        </w:rPr>
-        <w:t xml:space="preserve">Create a </w:t>
-      </w:r>
-      <w:r>
-        <w:rPr>
-          <w:rFonts w:cstheme="minorHAnsi"/>
-          <w:color w:val="000000"/>
-          <w:sz w:val="24"/>
-          <w:szCs w:val="24"/>
-          <w:shd w:val="clear" w:color="auto" w:fill="FFFFFF"/>
-        </w:rPr>
-        <w:t>line graph</w:t>
-      </w:r>
-      <w:r>
-        <w:rPr>
-          <w:rFonts w:cstheme="minorHAnsi"/>
-          <w:color w:val="000000"/>
-          <w:sz w:val="24"/>
-          <w:szCs w:val="24"/>
-          <w:shd w:val="clear" w:color="auto" w:fill="FFFFFF"/>
-        </w:rPr>
-        <w:t xml:space="preserve"> of yearly </w:t>
-      </w:r>
-      <w:r>
-        <w:rPr>
-          <w:rFonts w:cstheme="minorHAnsi"/>
-          <w:color w:val="000000"/>
-          <w:sz w:val="24"/>
-          <w:szCs w:val="24"/>
-          <w:shd w:val="clear" w:color="auto" w:fill="FFFFFF"/>
-        </w:rPr>
-        <w:t xml:space="preserve">real </w:t>
-      </w:r>
-      <w:r>
-        <w:rPr>
-          <w:rFonts w:cstheme="minorHAnsi"/>
-          <w:color w:val="000000"/>
-          <w:sz w:val="24"/>
-          <w:szCs w:val="24"/>
-          <w:shd w:val="clear" w:color="auto" w:fill="FFFFFF"/>
-        </w:rPr>
-        <w:t xml:space="preserve">returns for each mutual fund. Make sure to include appropriate and professional titles and axes labels. </w:t>
-      </w:r>
-      <w:r>
-        <w:rPr>
-          <w:rFonts w:cstheme="minorHAnsi"/>
-          <w:color w:val="156082" w:themeColor="accent1"/>
-          <w:sz w:val="24"/>
-          <w:szCs w:val="24"/>
-          <w:shd w:val="clear" w:color="auto" w:fill="FFFFFF"/>
-        </w:rPr>
-        <w:t xml:space="preserve">Please copy and paste </w:t>
-      </w:r>
-      <w:r>
-        <w:rPr>
-          <w:rFonts w:cstheme="minorHAnsi"/>
-          <w:color w:val="156082" w:themeColor="accent1"/>
-          <w:sz w:val="24"/>
-          <w:szCs w:val="24"/>
-          <w:u w:val="single"/>
-          <w:shd w:val="clear" w:color="auto" w:fill="FFFFFF"/>
-        </w:rPr>
-        <w:t>all 6</w:t>
-      </w:r>
-      <w:r>
-        <w:rPr>
-          <w:rFonts w:cstheme="minorHAnsi"/>
-          <w:color w:val="156082" w:themeColor="accent1"/>
-          <w:sz w:val="24"/>
-          <w:szCs w:val="24"/>
-          <w:u w:val="single"/>
-          <w:shd w:val="clear" w:color="auto" w:fill="FFFFFF"/>
-        </w:rPr>
-        <w:t xml:space="preserve"> </w:t>
-      </w:r>
-      <w:r>
-        <w:rPr>
-          <w:rFonts w:cstheme="minorHAnsi"/>
-          <w:color w:val="156082" w:themeColor="accent1"/>
-          <w:sz w:val="24"/>
-          <w:szCs w:val="24"/>
-          <w:u w:val="single"/>
-          <w:shd w:val="clear" w:color="auto" w:fill="FFFFFF"/>
-        </w:rPr>
-        <w:t>line graphs</w:t>
-      </w:r>
-      <w:r>
-        <w:rPr>
-          <w:rFonts w:cstheme="minorHAnsi"/>
-          <w:color w:val="156082" w:themeColor="accent1"/>
-          <w:sz w:val="24"/>
-          <w:szCs w:val="24"/>
-          <w:shd w:val="clear" w:color="auto" w:fill="FFFFFF"/>
-        </w:rPr>
-        <w:t xml:space="preserve"> here in the Word document for easier grading.</w:t>
-      </w:r>
-    </w:p>
-    <w:p>
-      <w:pPr>
-        <w:spacing w:after="0" w:line="240" w:lineRule="auto"/>
-        <w:rPr>
-          <w:sz w:val="24"/>
-          <w:szCs w:val="24"/>
-        </w:rPr>
-      </w:pPr>
-    </w:p>
-    <w:p>
-      <w:pPr>
-        <w:spacing w:after="0" w:line="278" w:lineRule="auto"/>
-        <w:rPr>
-          <w:rFonts w:cstheme="minorHAnsi"/>
-          <w:color w:val="000000"/>
-          <w:sz w:val="24"/>
-          <w:szCs w:val="24"/>
-          <w:shd w:val="clear" w:color="auto" w:fill="FFFFFF"/>
-        </w:rPr>
-      </w:pPr>
-      <w:r>
-        <w:rPr>
-          <w:rFonts w:cstheme="minorHAnsi"/>
-          <w:b/>
-          <w:bCs/>
-          <w:color w:val="000000"/>
-          <w:sz w:val="24"/>
-          <w:szCs w:val="24"/>
-          <w:shd w:val="clear" w:color="auto" w:fill="FFFFFF"/>
-        </w:rPr>
-        <w:t xml:space="preserve">RStudio code for </w:t>
-      </w:r>
-      <w:r>
-        <w:rPr>
-          <w:rFonts w:cstheme="minorHAnsi"/>
-          <w:b/>
-          <w:bCs/>
-          <w:color w:val="000000"/>
-          <w:sz w:val="24"/>
-          <w:szCs w:val="24"/>
-          <w:shd w:val="clear" w:color="auto" w:fill="FFFFFF"/>
-        </w:rPr>
-        <w:t>line graph</w:t>
-      </w:r>
-      <w:r>
-        <w:rPr>
-          <w:rFonts w:cstheme="minorHAnsi"/>
-          <w:b/>
-          <w:bCs/>
-          <w:color w:val="000000"/>
-          <w:sz w:val="24"/>
-          <w:szCs w:val="24"/>
-          <w:shd w:val="clear" w:color="auto" w:fill="FFFFFF"/>
-        </w:rPr>
-        <w:t xml:space="preserve"> </w:t>
-      </w:r>
-      <w:r>
-        <w:rPr>
-          <w:rFonts w:cstheme="minorHAnsi"/>
-          <w:color w:val="000000"/>
-          <w:sz w:val="24"/>
-          <w:szCs w:val="24"/>
-          <w:shd w:val="clear" w:color="auto" w:fill="FFFFFF"/>
-        </w:rPr>
-        <w:t>(</w:t>
-      </w:r>
-      <w:r>
-        <w:rPr>
-          <w:rFonts w:cstheme="minorHAnsi"/>
-          <w:color w:val="000000"/>
-          <w:sz w:val="24"/>
-          <w:szCs w:val="24"/>
-          <w:shd w:val="clear" w:color="auto" w:fill="FFFFFF"/>
-        </w:rPr>
-        <w:t>Note: t</w:t>
-      </w:r>
-      <w:r>
-        <w:rPr>
-          <w:rFonts w:cstheme="minorHAnsi"/>
-          <w:color w:val="000000"/>
-          <w:sz w:val="24"/>
-          <w:szCs w:val="24"/>
-          <w:shd w:val="clear" w:color="auto" w:fill="FFFFFF"/>
-        </w:rPr>
-        <w:t xml:space="preserve">he first variable listed should be your </w:t>
-      </w:r>
-      <w:r>
-        <w:rPr>
-          <w:rFonts w:cstheme="minorHAnsi"/>
-          <w:color w:val="000000"/>
-          <w:sz w:val="24"/>
-          <w:szCs w:val="24"/>
-          <w:shd w:val="clear" w:color="auto" w:fill="FFFFFF"/>
-        </w:rPr>
-        <w:t xml:space="preserve">mutual </w:t>
-      </w:r>
-      <w:r>
-        <w:rPr>
-          <w:rFonts w:cstheme="minorHAnsi"/>
-          <w:color w:val="000000"/>
-          <w:sz w:val="24"/>
-          <w:szCs w:val="24"/>
-          <w:shd w:val="clear" w:color="auto" w:fill="FFFFFF"/>
-        </w:rPr>
-        <w:t>fund variable and the second variable should be the Date variable.)</w:t>
+          <w:color w:val="000000"/>
+          <w:sz w:val="24"/>
+          <w:szCs w:val="24"/>
+          <w:shd w:val="clear" w:color="auto" w:fill="FFFFFF"/>
+        </w:rPr>
+      </w:pPr>
+      <w:r>
+        <w:rPr>
+          <w:rFonts w:cstheme="minorHAnsi"/>
+          <w:b/>
+          <w:bCs/>
+          <w:color w:val="000000"/>
+          <w:sz w:val="24"/>
+          <w:szCs w:val="24"/>
+          <w:shd w:val="clear" w:color="auto" w:fill="FFFFFF"/>
+        </w:rPr>
+        <w:t xml:space="preserve">RStudio code for line graph </w:t>
+      </w:r>
+      <w:r>
+        <w:rPr>
+          <w:rFonts w:cstheme="minorHAnsi"/>
+          <w:color w:val="000000"/>
+          <w:sz w:val="24"/>
+          <w:szCs w:val="24"/>
+          <w:shd w:val="clear" w:color="auto" w:fill="FFFFFF"/>
+        </w:rPr>
+        <w:t xml:space="preserve">(Note: the first variable listed should be your mutual fund variable and the second variable should be the Date variable.)</w:t>
       </w:r>
     </w:p>
     <w:p>
@@ -2688,197 +2307,7 @@
           <w:szCs w:val="24"/>
           <w:shd w:val="clear" w:color="auto" w:fill="FFFFFF"/>
         </w:rPr>
-        <w:t>"</w:t>
-      </w:r>
-      <w:r>
-        <w:rPr>
-          <w:rFonts w:cstheme="minorHAnsi"/>
-          <w:color w:val="000000"/>
-          <w:sz w:val="24"/>
-          <w:szCs w:val="24"/>
-          <w:shd w:val="clear" w:color="auto" w:fill="FFFFFF"/>
-        </w:rPr>
-        <w:t>Title</w:t>
-      </w:r>
-      <w:r>
-        <w:rPr>
-          <w:rFonts w:cstheme="minorHAnsi"/>
-          <w:color w:val="000000"/>
-          <w:sz w:val="24"/>
-          <w:szCs w:val="24"/>
-          <w:shd w:val="clear" w:color="auto" w:fill="FFFFFF"/>
-        </w:rPr>
-        <w:t>"</w:t>
-      </w:r>
-      <w:r>
-        <w:rPr>
-          <w:rFonts w:cstheme="minorHAnsi"/>
-          <w:color w:val="000000"/>
-          <w:sz w:val="24"/>
-          <w:szCs w:val="24"/>
-          <w:shd w:val="clear" w:color="auto" w:fill="FFFFFF"/>
-        </w:rPr>
-        <w:t xml:space="preserve">, xlab = </w:t>
-      </w:r>
-      <w:r>
-        <w:rPr>
-          <w:rFonts w:cstheme="minorHAnsi"/>
-          <w:color w:val="000000"/>
-          <w:sz w:val="24"/>
-          <w:szCs w:val="24"/>
-          <w:shd w:val="clear" w:color="auto" w:fill="FFFFFF"/>
-        </w:rPr>
-        <w:t>"</w:t>
-      </w:r>
-      <w:r>
-        <w:rPr>
-          <w:rFonts w:cstheme="minorHAnsi"/>
-          <w:color w:val="000000"/>
-          <w:sz w:val="24"/>
-          <w:szCs w:val="24"/>
-          <w:shd w:val="clear" w:color="auto" w:fill="FFFFFF"/>
-        </w:rPr>
-        <w:t>label</w:t>
-      </w:r>
-      <w:r>
-        <w:rPr>
-          <w:rFonts w:cstheme="minorHAnsi"/>
-          <w:color w:val="000000"/>
-          <w:sz w:val="24"/>
-          <w:szCs w:val="24"/>
-          <w:shd w:val="clear" w:color="auto" w:fill="FFFFFF"/>
-        </w:rPr>
-        <w:t>"</w:t>
-      </w:r>
-      <w:r>
-        <w:rPr>
-          <w:rFonts w:cstheme="minorHAnsi"/>
-          <w:color w:val="000000"/>
-          <w:sz w:val="24"/>
-          <w:szCs w:val="24"/>
-          <w:shd w:val="clear" w:color="auto" w:fill="FFFFFF"/>
-        </w:rPr>
-        <w:t xml:space="preserve">, ylab = </w:t>
-      </w:r>
-      <w:r>
-        <w:rPr>
-          <w:rFonts w:cstheme="minorHAnsi"/>
-          <w:color w:val="000000"/>
-          <w:sz w:val="24"/>
-          <w:szCs w:val="24"/>
-          <w:shd w:val="clear" w:color="auto" w:fill="FFFFFF"/>
-        </w:rPr>
-        <w:t>"</w:t>
-      </w:r>
-      <w:r>
-        <w:rPr>
-          <w:rFonts w:cstheme="minorHAnsi"/>
-          <w:color w:val="000000"/>
-          <w:sz w:val="24"/>
-          <w:szCs w:val="24"/>
-          <w:shd w:val="clear" w:color="auto" w:fill="FFFFFF"/>
-        </w:rPr>
-        <w:t>label</w:t>
-      </w:r>
-      <w:r>
-        <w:rPr>
-          <w:rFonts w:cstheme="minorHAnsi"/>
-          <w:color w:val="000000"/>
-          <w:sz w:val="24"/>
-          <w:szCs w:val="24"/>
-          <w:shd w:val="clear" w:color="auto" w:fill="FFFFFF"/>
-        </w:rPr>
-        <w:t>"</w:t>
-      </w:r>
-      <w:r>
-        <w:rPr>
-          <w:rFonts w:cstheme="minorHAnsi"/>
-          <w:color w:val="000000"/>
-          <w:sz w:val="24"/>
-          <w:szCs w:val="24"/>
-          <w:shd w:val="clear" w:color="auto" w:fill="FFFFFF"/>
-        </w:rPr>
-        <w:t xml:space="preserve">, col = </w:t>
-      </w:r>
-      <w:r>
-        <w:rPr>
-          <w:rFonts w:cstheme="minorHAnsi"/>
-          <w:color w:val="000000"/>
-          <w:sz w:val="24"/>
-          <w:szCs w:val="24"/>
-          <w:shd w:val="clear" w:color="auto" w:fill="FFFFFF"/>
-        </w:rPr>
-        <w:t>"</w:t>
-      </w:r>
-      <w:r>
-        <w:rPr>
-          <w:rFonts w:cstheme="minorHAnsi"/>
-          <w:color w:val="000000"/>
-          <w:sz w:val="24"/>
-          <w:szCs w:val="24"/>
-          <w:shd w:val="clear" w:color="auto" w:fill="FFFFFF"/>
-        </w:rPr>
-        <w:t>color</w:t>
-      </w:r>
-      <w:r>
-        <w:rPr>
-          <w:rFonts w:cstheme="minorHAnsi"/>
-          <w:color w:val="000000"/>
-          <w:sz w:val="24"/>
-          <w:szCs w:val="24"/>
-          <w:shd w:val="clear" w:color="auto" w:fill="FFFFFF"/>
-        </w:rPr>
-        <w:t>"</w:t>
-      </w:r>
-      <w:r>
-        <w:rPr>
-          <w:rFonts w:cstheme="minorHAnsi"/>
-          <w:color w:val="000000"/>
-          <w:sz w:val="24"/>
-          <w:szCs w:val="24"/>
-          <w:shd w:val="clear" w:color="auto" w:fill="FFFFFF"/>
-        </w:rPr>
-        <w:t xml:space="preserve">, type = </w:t>
-      </w:r>
-      <w:r>
-        <w:rPr>
-          <w:rFonts w:cstheme="minorHAnsi"/>
-          <w:color w:val="000000"/>
-          <w:sz w:val="24"/>
-          <w:szCs w:val="24"/>
-          <w:shd w:val="clear" w:color="auto" w:fill="FFFFFF"/>
-        </w:rPr>
-        <w:t>"</w:t>
-      </w:r>
-      <w:r>
-        <w:rPr>
-          <w:rFonts w:cstheme="minorHAnsi"/>
-          <w:color w:val="000000"/>
-          <w:sz w:val="24"/>
-          <w:szCs w:val="24"/>
-          <w:shd w:val="clear" w:color="auto" w:fill="FFFFFF"/>
-        </w:rPr>
-        <w:t>l</w:t>
-      </w:r>
-      <w:r>
-        <w:rPr>
-          <w:rFonts w:cstheme="minorHAnsi"/>
-          <w:color w:val="000000"/>
-          <w:sz w:val="24"/>
-          <w:szCs w:val="24"/>
-          <w:shd w:val="clear" w:color="auto" w:fill="FFFFFF"/>
-        </w:rPr>
-        <w:t>"</w:t>
-      </w:r>
-      <w:r>
-        <w:rPr>
-          <w:rFonts w:cstheme="minorHAnsi"/>
-          <w:color w:val="000000"/>
-          <w:sz w:val="24"/>
-          <w:szCs w:val="24"/>
-          <w:shd w:val="clear" w:color="auto" w:fill="FFFFFF"/>
-        </w:rPr>
-        <w:t>, ylim = c(-25, 25))</w:t>
+        <w:t xml:space="preserve">"Title", xlab = "label", ylab = "label", col = "color", type = "l", ylim = c(-25, 25))</w:t>
       </w:r>
     </w:p>
     <w:p>
@@ -3270,47 +2699,7 @@
           <w:szCs w:val="24"/>
           <w:u w:val="single"/>
         </w:rPr>
-        <w:t>Step</w:t>
-      </w:r>
-      <w:r>
-        <w:rPr>
-          <w:b/>
-          <w:bCs/>
-          <w:sz w:val="24"/>
-          <w:szCs w:val="24"/>
-          <w:u w:val="single"/>
-        </w:rPr>
-        <w:t xml:space="preserve"> </w:t>
-      </w:r>
-      <w:r>
-        <w:rPr>
-          <w:b/>
-          <w:bCs/>
-          <w:sz w:val="24"/>
-          <w:szCs w:val="24"/>
-          <w:u w:val="single"/>
-        </w:rPr>
-        <w:t>3</w:t>
-      </w:r>
-      <w:r>
-        <w:rPr>
-          <w:b/>
-          <w:bCs/>
-          <w:sz w:val="24"/>
-          <w:szCs w:val="24"/>
-          <w:u w:val="single"/>
-        </w:rPr>
-        <w:t>b</w:t>
-      </w:r>
-      <w:r>
-        <w:rPr>
-          <w:b/>
-          <w:bCs/>
-          <w:sz w:val="24"/>
-          <w:szCs w:val="24"/>
-          <w:u w:val="single"/>
-        </w:rPr>
-        <w:t>.</w:t>
+        <w:t xml:space="preserve">Step 3b.</w:t>
       </w:r>
       <w:r>
         <w:rPr>
@@ -3336,28 +2725,7 @@
           <w:sz w:val="24"/>
           <w:szCs w:val="24"/>
         </w:rPr>
-        <w:t xml:space="preserve">Comment on the line charts for each company. </w:t>
-      </w:r>
-      <w:r>
-        <w:rPr>
-          <w:sz w:val="24"/>
-          <w:szCs w:val="24"/>
-        </w:rPr>
-        <w:t>Do you notice any similarities, differences, etc.</w:t>
-      </w:r>
-      <w:r>
-        <w:rPr>
-          <w:sz w:val="24"/>
-          <w:szCs w:val="24"/>
-        </w:rPr>
-        <w:t xml:space="preserve"> in the real returns for each company</w:t>
-      </w:r>
-      <w:r>
-        <w:rPr>
-          <w:sz w:val="24"/>
-          <w:szCs w:val="24"/>
-        </w:rPr>
-        <w:t xml:space="preserve">? </w:t>
+        <w:t xml:space="preserve">Comment on the line charts for each company. Do you notice any similarities, differences, etc. in the real returns for each company? </w:t>
       </w:r>
       <w:r>
         <w:rPr>
@@ -3433,33 +2801,7 @@
           <w:shd w:val="clear" w:color="auto" w:fill="FFFFFF"/>
         </w:rPr>
         <w:lastRenderedPageBreak/>
-        <w:t xml:space="preserve">Step </w:t>
-      </w:r>
-      <w:r>
-        <w:rPr>
-          <w:rFonts w:cstheme="minorHAnsi"/>
-          <w:b/>
-          <w:bCs/>
-          <w:color w:val="000000"/>
-          <w:sz w:val="24"/>
-          <w:szCs w:val="24"/>
-          <w:u w:val="single"/>
-          <w:shd w:val="clear" w:color="auto" w:fill="FFFFFF"/>
-        </w:rPr>
-        <w:t>4</w:t>
-      </w:r>
-      <w:r>
-        <w:rPr>
-          <w:rFonts w:cstheme="minorHAnsi"/>
-          <w:b/>
-          <w:bCs/>
-          <w:color w:val="000000"/>
-          <w:sz w:val="24"/>
-          <w:szCs w:val="24"/>
-          <w:u w:val="single"/>
-          <w:shd w:val="clear" w:color="auto" w:fill="FFFFFF"/>
-        </w:rPr>
-        <w:t xml:space="preserve"> – Create portfolios with two mutual funds.</w:t>
+        <w:t xml:space="preserve">Step 4 – Create portfolios with two mutual funds.</w:t>
       </w:r>
     </w:p>
     <w:p>
@@ -3576,17 +2918,17 @@
           <w:szCs w:val="24"/>
           <w:shd w:val="clear" w:color="auto" w:fill="FFFFFF"/>
         </w:rPr>
-        <w:t>INDICATE WHICH TWO (2) FUNDS YOU CHOSE</w:t>
-      </w:r>
-      <w:r>
-        <w:rPr>
-          <w:rFonts w:cstheme="minorHAnsi"/>
-          <w:color w:val="156082" w:themeColor="accent1"/>
-          <w:sz w:val="24"/>
-          <w:szCs w:val="24"/>
-          <w:shd w:val="clear" w:color="auto" w:fill="FFFFFF"/>
-        </w:rPr>
-        <w:t>:</w:t>
+        <w:t>INDICATE WHICH TWO (2) FUNDS YOU CHOSE:</w:t>
+      </w:r>
+      <w:r>
+        <w:rPr>
+          <w:rFonts w:cstheme="minorHAnsi"/>
+          <w:color w:val="000000"/>
+          <w:sz w:val="24"/>
+          <w:szCs w:val="24"/>
+          <w:shd w:val="clear" w:color="auto" w:fill="FFFFFF"/>
+        </w:rPr>
+        <w:t xml:space="preserve"> Health Care (40%) and Information Technology (60%)</w:t>
       </w:r>
     </w:p>
     <w:p>
@@ -3659,6 +3001,16 @@
         </w:rPr>
         <w:t xml:space="preserve">) = </w:t>
       </w:r>
+      <w:r>
+        <w:rPr>
+          <w:rFonts w:cstheme="minorHAnsi"/>
+          <w:color w:val="000000"/>
+          <w:sz w:val="24"/>
+          <w:szCs w:val="24"/>
+          <w:shd w:val="clear" w:color="auto" w:fill="FFFFFF"/>
+        </w:rPr>
+        <w:t>0.4119</w:t>
+      </w:r>
     </w:p>
     <w:p>
       <w:pPr>
@@ -3684,6 +3036,16 @@
         </w:rPr>
         <w:t xml:space="preserve">Expected Return = </w:t>
       </w:r>
+      <w:r>
+        <w:rPr>
+          <w:rFonts w:cstheme="minorHAnsi"/>
+          <w:color w:val="000000"/>
+          <w:sz w:val="24"/>
+          <w:szCs w:val="24"/>
+          <w:shd w:val="clear" w:color="auto" w:fill="FFFFFF"/>
+        </w:rPr>
+        <w:t>1.1481%</w:t>
+      </w:r>
     </w:p>
     <w:p>
       <w:pPr>
@@ -3709,6 +3071,16 @@
         </w:rPr>
         <w:t xml:space="preserve">Variance = </w:t>
       </w:r>
+      <w:r>
+        <w:rPr>
+          <w:rFonts w:cstheme="minorHAnsi"/>
+          <w:color w:val="000000"/>
+          <w:sz w:val="24"/>
+          <w:szCs w:val="24"/>
+          <w:shd w:val="clear" w:color="auto" w:fill="FFFFFF"/>
+        </w:rPr>
+        <w:t>32.9008</w:t>
+      </w:r>
     </w:p>
     <w:p>
       <w:pPr>
@@ -3734,6 +3106,16 @@
         </w:rPr>
         <w:t xml:space="preserve">Standard Deviation = </w:t>
       </w:r>
+      <w:r>
+        <w:rPr>
+          <w:rFonts w:cstheme="minorHAnsi"/>
+          <w:color w:val="000000"/>
+          <w:sz w:val="24"/>
+          <w:szCs w:val="24"/>
+          <w:shd w:val="clear" w:color="auto" w:fill="FFFFFF"/>
+        </w:rPr>
+        <w:t>5.7359%</w:t>
+      </w:r>
     </w:p>
     <w:p>
       <w:pPr>
@@ -3803,17 +3185,17 @@
           <w:szCs w:val="24"/>
           <w:shd w:val="clear" w:color="auto" w:fill="FFFFFF"/>
         </w:rPr>
-        <w:t>INDICATE WHICH TWO (2) FUNDS YOU CHOSE</w:t>
-      </w:r>
-      <w:r>
-        <w:rPr>
-          <w:rFonts w:cstheme="minorHAnsi"/>
-          <w:color w:val="156082" w:themeColor="accent1"/>
-          <w:sz w:val="24"/>
-          <w:szCs w:val="24"/>
-          <w:shd w:val="clear" w:color="auto" w:fill="FFFFFF"/>
-        </w:rPr>
-        <w:t>:</w:t>
+        <w:t>INDICATE WHICH TWO (2) FUNDS YOU CHOSE:</w:t>
+      </w:r>
+      <w:r>
+        <w:rPr>
+          <w:rFonts w:cstheme="minorHAnsi"/>
+          <w:color w:val="000000"/>
+          <w:sz w:val="24"/>
+          <w:szCs w:val="24"/>
+          <w:shd w:val="clear" w:color="auto" w:fill="FFFFFF"/>
+        </w:rPr>
+        <w:t xml:space="preserve"> Energy (40%) and Utilities (60%)</w:t>
       </w:r>
     </w:p>
     <w:p>
@@ -3886,6 +3268,16 @@
         </w:rPr>
         <w:t xml:space="preserve">) = </w:t>
       </w:r>
+      <w:r>
+        <w:rPr>
+          <w:rFonts w:cstheme="minorHAnsi"/>
+          <w:color w:val="000000"/>
+          <w:sz w:val="24"/>
+          <w:szCs w:val="24"/>
+          <w:shd w:val="clear" w:color="auto" w:fill="FFFFFF"/>
+        </w:rPr>
+        <w:t>0.3199</w:t>
+      </w:r>
     </w:p>
     <w:p>
       <w:pPr>
@@ -3911,6 +3303,16 @@
         </w:rPr>
         <w:t xml:space="preserve">Expected Return = </w:t>
       </w:r>
+      <w:r>
+        <w:rPr>
+          <w:rFonts w:cstheme="minorHAnsi"/>
+          <w:color w:val="000000"/>
+          <w:sz w:val="24"/>
+          <w:szCs w:val="24"/>
+          <w:shd w:val="clear" w:color="auto" w:fill="FFFFFF"/>
+        </w:rPr>
+        <w:t>1.1797%</w:t>
+      </w:r>
     </w:p>
     <w:p>
       <w:pPr>
@@ -3936,6 +3338,16 @@
         </w:rPr>
         <w:t xml:space="preserve">Variance = </w:t>
       </w:r>
+      <w:r>
+        <w:rPr>
+          <w:rFonts w:cstheme="minorHAnsi"/>
+          <w:color w:val="000000"/>
+          <w:sz w:val="24"/>
+          <w:szCs w:val="24"/>
+          <w:shd w:val="clear" w:color="auto" w:fill="FFFFFF"/>
+        </w:rPr>
+        <w:t>25.0023</w:t>
+      </w:r>
     </w:p>
     <w:p>
       <w:pPr>
@@ -3961,6 +3373,16 @@
         </w:rPr>
         <w:t xml:space="preserve">Standard Deviation = </w:t>
       </w:r>
+      <w:r>
+        <w:rPr>
+          <w:rFonts w:cstheme="minorHAnsi"/>
+          <w:color w:val="000000"/>
+          <w:sz w:val="24"/>
+          <w:szCs w:val="24"/>
+          <w:shd w:val="clear" w:color="auto" w:fill="FFFFFF"/>
+        </w:rPr>
+        <w:t>5.0002%</w:t>
+      </w:r>
     </w:p>
     <w:p>
       <w:pPr>
@@ -4030,17 +3452,17 @@
           <w:szCs w:val="24"/>
           <w:shd w:val="clear" w:color="auto" w:fill="FFFFFF"/>
         </w:rPr>
-        <w:t>INDICATE WHICH TWO (2) FUNDS YOU CHOSE</w:t>
-      </w:r>
-      <w:r>
-        <w:rPr>
-          <w:rFonts w:cstheme="minorHAnsi"/>
-          <w:color w:val="156082" w:themeColor="accent1"/>
-          <w:sz w:val="24"/>
-          <w:szCs w:val="24"/>
-          <w:shd w:val="clear" w:color="auto" w:fill="FFFFFF"/>
-        </w:rPr>
-        <w:t>:</w:t>
+        <w:t>INDICATE WHICH TWO (2) FUNDS YOU CHOSE:</w:t>
+      </w:r>
+      <w:r>
+        <w:rPr>
+          <w:rFonts w:cstheme="minorHAnsi"/>
+          <w:color w:val="000000"/>
+          <w:sz w:val="24"/>
+          <w:szCs w:val="24"/>
+          <w:shd w:val="clear" w:color="auto" w:fill="FFFFFF"/>
+        </w:rPr>
+        <w:t xml:space="preserve"> Consumer Staples (40%) and Financials (60%)</w:t>
       </w:r>
     </w:p>
     <w:p>
@@ -4113,6 +3535,16 @@
         </w:rPr>
         <w:t xml:space="preserve">) = </w:t>
       </w:r>
+      <w:r>
+        <w:rPr>
+          <w:rFonts w:cstheme="minorHAnsi"/>
+          <w:color w:val="000000"/>
+          <w:sz w:val="24"/>
+          <w:szCs w:val="24"/>
+          <w:shd w:val="clear" w:color="auto" w:fill="FFFFFF"/>
+        </w:rPr>
+        <w:t>0.5605</w:t>
+      </w:r>
     </w:p>
     <w:p>
       <w:pPr>
@@ -4138,6 +3570,16 @@
         </w:rPr>
         <w:t xml:space="preserve">Expected Return = </w:t>
       </w:r>
+      <w:r>
+        <w:rPr>
+          <w:rFonts w:cstheme="minorHAnsi"/>
+          <w:color w:val="000000"/>
+          <w:sz w:val="24"/>
+          <w:szCs w:val="24"/>
+          <w:shd w:val="clear" w:color="auto" w:fill="FFFFFF"/>
+        </w:rPr>
+        <w:t>0.9542%</w:t>
+      </w:r>
     </w:p>
     <w:p>
       <w:pPr>
@@ -4163,6 +3605,16 @@
         </w:rPr>
         <w:t xml:space="preserve">Variance = </w:t>
       </w:r>
+      <w:r>
+        <w:rPr>
+          <w:rFonts w:cstheme="minorHAnsi"/>
+          <w:color w:val="000000"/>
+          <w:sz w:val="24"/>
+          <w:szCs w:val="24"/>
+          <w:shd w:val="clear" w:color="auto" w:fill="FFFFFF"/>
+        </w:rPr>
+        <w:t>30.7020</w:t>
+      </w:r>
     </w:p>
     <w:p>
       <w:pPr>
@@ -4188,6 +3640,16 @@
         </w:rPr>
         <w:t xml:space="preserve">Standard Deviation = </w:t>
       </w:r>
+      <w:r>
+        <w:rPr>
+          <w:rFonts w:cstheme="minorHAnsi"/>
+          <w:color w:val="000000"/>
+          <w:sz w:val="24"/>
+          <w:szCs w:val="24"/>
+          <w:shd w:val="clear" w:color="auto" w:fill="FFFFFF"/>
+        </w:rPr>
+        <w:t>5.5409%</w:t>
+      </w:r>
     </w:p>
     <w:p>
       <w:pPr>
@@ -4329,27 +3791,7 @@
           <w:szCs w:val="24"/>
           <w:shd w:val="clear" w:color="auto" w:fill="FFFFFF"/>
         </w:rPr>
-        <w:t xml:space="preserve">Which of the portfolios you created in </w:t>
-      </w:r>
-      <w:r>
-        <w:rPr>
-          <w:rFonts w:cstheme="minorHAnsi"/>
-          <w:color w:val="000000"/>
-          <w:sz w:val="24"/>
-          <w:szCs w:val="24"/>
-          <w:shd w:val="clear" w:color="auto" w:fill="FFFFFF"/>
-        </w:rPr>
-        <w:t>Step 4</w:t>
-      </w:r>
-      <w:r>
-        <w:rPr>
-          <w:rFonts w:cstheme="minorHAnsi"/>
-          <w:color w:val="000000"/>
-          <w:sz w:val="24"/>
-          <w:szCs w:val="24"/>
-          <w:shd w:val="clear" w:color="auto" w:fill="FFFFFF"/>
-        </w:rPr>
-        <w:t xml:space="preserve"> would you recommend given the following priorities? For each priority, identify which portfolio you recommend and the justification for your choice. Your response should be in complete sentence(s).</w:t>
+        <w:t xml:space="preserve">Which of the portfolios you created in Step 4 would you recommend given the following priorities? For each priority, identify which portfolio you recommend and the justification for your choice. Your response should be in complete sentence(s).</w:t>
       </w:r>
     </w:p>
     <w:p>
@@ -4577,27 +4019,7 @@
           <w:szCs w:val="24"/>
           <w:shd w:val="clear" w:color="auto" w:fill="FFFFFF"/>
         </w:rPr>
-        <w:t xml:space="preserve">Which of the three portfolios you created in Step 4 would you be most likely to invest in? </w:t>
-      </w:r>
-      <w:r>
-        <w:rPr>
-          <w:rFonts w:cstheme="minorHAnsi"/>
-          <w:color w:val="000000"/>
-          <w:sz w:val="24"/>
-          <w:szCs w:val="24"/>
-          <w:shd w:val="clear" w:color="auto" w:fill="FFFFFF"/>
-        </w:rPr>
-        <w:t>Identify</w:t>
-      </w:r>
-      <w:r>
-        <w:rPr>
-          <w:rFonts w:cstheme="minorHAnsi"/>
-          <w:color w:val="000000"/>
-          <w:sz w:val="24"/>
-          <w:szCs w:val="24"/>
-          <w:shd w:val="clear" w:color="auto" w:fill="FFFFFF"/>
-        </w:rPr>
-        <w:t xml:space="preserve"> your own investing priorities and determine which best fits your preferences. No investment options are perfect, so be sure to discuss the pros and cons of your chosen portfolio and then justify your final choice. Your response should be in complete sentence(s).</w:t>
+        <w:t xml:space="preserve">Which of the three portfolios you created in Step 4 would you be most likely to invest in? Identify your own investing priorities and determine which best fits your preferences. No investment options are perfect, so be sure to discuss the pros and cons of your chosen portfolio and then justify your final choice. Your response should be in complete sentence(s).</w:t>
       </w:r>
     </w:p>
     <w:p>

</xml_diff>